<commit_message>
grosse modife le texte
</commit_message>
<xml_diff>
--- a/redaction/chapitre1/paragraphes.docx
+++ b/redaction/chapitre1/paragraphes.docx
@@ -2050,18 +2050,21 @@
       </w:r>
     </w:p>
     <w:bookmarkEnd w:id="25"/>
-    <w:bookmarkStart w:id="26" w:name="exercices"/>
+    <w:bookmarkStart w:id="26" w:name="exercices-de-fin-de-chapitre"/>
     <w:p>
       <w:pPr>
         <w:pStyle w:val="Heading3"/>
       </w:pPr>
       <w:r>
-        <w:t xml:space="preserve">Exercices</w:t>
-      </w:r>
-    </w:p>
-    <w:p>
-      <w:pPr>
-        <w:pStyle w:val="FirstParagraph"/>
+        <w:t xml:space="preserve">Exercices de fin de chapitre</w:t>
+      </w:r>
+    </w:p>
+    <w:p>
+      <w:pPr>
+        <w:numPr>
+          <w:ilvl w:val="0"/>
+          <w:numId w:val="1002"/>
+        </w:numPr>
       </w:pPr>
       <w:r>
         <w:rPr>
@@ -2091,7 +2094,10 @@
     </w:p>
     <w:p>
       <w:pPr>
-        <w:pStyle w:val="BodyText"/>
+        <w:numPr>
+          <w:ilvl w:val="0"/>
+          <w:numId w:val="1002"/>
+        </w:numPr>
       </w:pPr>
       <w:r>
         <w:rPr>
@@ -2334,11 +2340,126 @@
       </w:pPr>
     </w:lvl>
   </w:abstractNum>
+  <w:abstractNum w:abstractNumId="99411">
+    <w:nsid w:val="A99411"/>
+    <w:multiLevelType w:val="multilevel"/>
+    <w:lvl w:ilvl="0">
+      <w:start w:val="1"/>
+      <w:numFmt w:val="decimal"/>
+      <w:lvlText w:val="%1."/>
+      <w:lvlJc w:val="left"/>
+      <w:pPr>
+        <w:ind w:left="720" w:hanging="480"/>
+      </w:pPr>
+    </w:lvl>
+    <w:lvl w:ilvl="1">
+      <w:start w:val="1"/>
+      <w:numFmt w:val="decimal"/>
+      <w:lvlText w:val="%2."/>
+      <w:lvlJc w:val="left"/>
+      <w:pPr>
+        <w:ind w:left="1440" w:hanging="480"/>
+      </w:pPr>
+    </w:lvl>
+    <w:lvl w:ilvl="2">
+      <w:start w:val="1"/>
+      <w:numFmt w:val="decimal"/>
+      <w:lvlText w:val="%3."/>
+      <w:lvlJc w:val="left"/>
+      <w:pPr>
+        <w:ind w:left="2160" w:hanging="480"/>
+      </w:pPr>
+    </w:lvl>
+    <w:lvl w:ilvl="3">
+      <w:start w:val="1"/>
+      <w:numFmt w:val="decimal"/>
+      <w:lvlText w:val="%4."/>
+      <w:lvlJc w:val="left"/>
+      <w:pPr>
+        <w:ind w:left="2880" w:hanging="480"/>
+      </w:pPr>
+    </w:lvl>
+    <w:lvl w:ilvl="4">
+      <w:start w:val="1"/>
+      <w:numFmt w:val="decimal"/>
+      <w:lvlText w:val="%5."/>
+      <w:lvlJc w:val="left"/>
+      <w:pPr>
+        <w:ind w:left="3600" w:hanging="480"/>
+      </w:pPr>
+    </w:lvl>
+    <w:lvl w:ilvl="5">
+      <w:start w:val="1"/>
+      <w:numFmt w:val="decimal"/>
+      <w:lvlText w:val="%6."/>
+      <w:lvlJc w:val="left"/>
+      <w:pPr>
+        <w:ind w:left="4320" w:hanging="480"/>
+      </w:pPr>
+    </w:lvl>
+    <w:lvl w:ilvl="6">
+      <w:start w:val="1"/>
+      <w:numFmt w:val="decimal"/>
+      <w:lvlText w:val="%7."/>
+      <w:lvlJc w:val="left"/>
+      <w:pPr>
+        <w:ind w:left="5040" w:hanging="480"/>
+      </w:pPr>
+    </w:lvl>
+    <w:lvl w:ilvl="7">
+      <w:start w:val="1"/>
+      <w:numFmt w:val="decimal"/>
+      <w:lvlText w:val="%8."/>
+      <w:lvlJc w:val="left"/>
+      <w:pPr>
+        <w:ind w:left="5760" w:hanging="480"/>
+      </w:pPr>
+    </w:lvl>
+    <w:lvl w:ilvl="8">
+      <w:start w:val="1"/>
+      <w:numFmt w:val="decimal"/>
+      <w:lvlText w:val="%9."/>
+      <w:lvlJc w:val="left"/>
+      <w:pPr>
+        <w:ind w:left="6480" w:hanging="480"/>
+      </w:pPr>
+    </w:lvl>
+  </w:abstractNum>
   <w:num w:numId="1000">
     <w:abstractNumId w:val="990"/>
   </w:num>
   <w:num w:numId="1001">
     <w:abstractNumId w:val="991"/>
+  </w:num>
+  <w:num w:numId="1002">
+    <w:abstractNumId w:val="99411"/>
+    <w:lvlOverride w:ilvl="0">
+      <w:startOverride w:val="1"/>
+    </w:lvlOverride>
+    <w:lvlOverride w:ilvl="1">
+      <w:startOverride w:val="1"/>
+    </w:lvlOverride>
+    <w:lvlOverride w:ilvl="2">
+      <w:startOverride w:val="1"/>
+    </w:lvlOverride>
+    <w:lvlOverride w:ilvl="3">
+      <w:startOverride w:val="1"/>
+    </w:lvlOverride>
+    <w:lvlOverride w:ilvl="4">
+      <w:startOverride w:val="1"/>
+    </w:lvlOverride>
+    <w:lvlOverride w:ilvl="5">
+      <w:startOverride w:val="1"/>
+    </w:lvlOverride>
+    <w:lvlOverride w:ilvl="6">
+      <w:startOverride w:val="1"/>
+    </w:lvlOverride>
+    <w:lvlOverride w:ilvl="7">
+      <w:startOverride w:val="1"/>
+    </w:lvlOverride>
+    <w:lvlOverride w:ilvl="8">
+      <w:startOverride w:val="1"/>
+    </w:lvlOverride>
   </w:num>
 </w:numbering>
 </file>

</xml_diff>